<commit_message>
전 화 긴 발화 반영(1~8부 4화) + 8부 5화 Counterfeit
- 1~4부: 긴 턴 10~15회(25~35단어), 5~8부: 긴 턴 10~15회(30~60단어)
- 전 화 부록 ④ 긴 발화 분석 추가
- 연속성 수정: 7부 8화 Jamal 대명사, 7부 5화 헤더 일수, 5부 12화 법률 비용·턴 번호
- 8부 5화 Counterfeit 신규, 연속성 노트 갱신
- docx 전체 재생성(-f markdown-subscript-superscript)

Co-Authored-By: Claude Opus 5.5 <noreply@anthropic.com>
Claude-Session: https://claude.ai/code/session_01N4vhCLeYxrjvGnDxQBD9Cq
</commit_message>
<xml_diff>
--- a/대본/1부/01화_The_ER.docx
+++ b/대본/1부/01화_The_ER.docx
@@ -65,16 +65,7 @@
         <w:t xml:space="preserve"> </w:t>
       </w:r>
       <w:r>
-        <w:t xml:space="preserve">- 규칙: 지문 없음. 전 화 100% 「화자명: 대사」. 1턴 15단어 이내 + 긴 턴 10</w:t>
-      </w:r>
-      <w:r>
-        <w:rPr>
-          <w:vertAlign w:val="subscript"/>
-        </w:rPr>
-        <w:t xml:space="preserve">15회(25</w:t>
-      </w:r>
-      <w:r>
-        <w:t xml:space="preserve">35단어).</w:t>
+        <w:t xml:space="preserve">- 규칙: 지문 없음. 전 화 100% 「화자명: 대사」. 1턴 15단어 이내 + 긴 턴 10~15회(25~35단어).</w:t>
       </w:r>
       <w:r>
         <w:t xml:space="preserve"> </w:t>

</xml_diff>